<commit_message>
Remove kafedra field in all reports
</commit_message>
<xml_diff>
--- a/L_1-3/Звіт 1-3 В. Стахнюк.docx
+++ b/L_1-3/Звіт 1-3 В. Стахнюк.docx
@@ -106,77 +106,6 @@
           <w:szCs w:val="32"/>
         </w:rPr>
       </w:r>
-    </w:p>
-    <w:p>
-      <w:pPr>
-        <w:pBdr/>
-        <w:spacing w:line="360" w:lineRule="auto"/>
-        <w:ind/>
-        <w:jc w:val="center"/>
-        <w:rPr>
-          <w:rFonts w:ascii="Times New Roman" w:hAnsi="Times New Roman" w:cs="Times New Roman"/>
-          <w:b/>
-          <w:bCs/>
-          <w:sz w:val="32"/>
-          <w:szCs w:val="32"/>
-        </w:rPr>
-      </w:pPr>
-      <w:r>
-        <w:rPr>
-          <w:rFonts w:ascii="Times New Roman" w:hAnsi="Times New Roman" w:cs="Times New Roman"/>
-          <w:sz w:val="32"/>
-          <w:szCs w:val="32"/>
-        </w:rPr>
-        <w:t xml:space="preserve">Кафедра радіоелектронних пристроїв</w:t>
-      </w:r>
-      <w:r>
-        <w:rPr>
-          <w:rFonts w:ascii="Times New Roman" w:hAnsi="Times New Roman" w:cs="Times New Roman"/>
-          <w:b/>
-          <w:bCs/>
-          <w:sz w:val="32"/>
-          <w:szCs w:val="32"/>
-        </w:rPr>
-        <w:t xml:space="preserve"> </w:t>
-      </w:r>
-      <w:r>
-        <w:rPr>
-          <w:rFonts w:ascii="Times New Roman" w:hAnsi="Times New Roman" w:cs="Times New Roman"/>
-          <w:sz w:val="32"/>
-          <w:szCs w:val="32"/>
-        </w:rPr>
-        <w:t xml:space="preserve">та систем</w:t>
-      </w:r>
-      <w:r>
-        <w:rPr>
-          <w:rFonts w:ascii="Times New Roman" w:hAnsi="Times New Roman" w:cs="Times New Roman"/>
-          <w:b/>
-          <w:bCs/>
-          <w:sz w:val="32"/>
-          <w:szCs w:val="32"/>
-        </w:rPr>
-      </w:r>
-      <w:r>
-        <w:rPr>
-          <w:rFonts w:ascii="Times New Roman" w:hAnsi="Times New Roman" w:cs="Times New Roman"/>
-          <w:b/>
-          <w:bCs/>
-          <w:sz w:val="32"/>
-          <w:szCs w:val="32"/>
-        </w:rPr>
-      </w:r>
-    </w:p>
-    <w:p>
-      <w:pPr>
-        <w:pBdr/>
-        <w:spacing/>
-        <w:ind/>
-        <w:rPr>
-          <w:rFonts w:ascii="Times New Roman" w:hAnsi="Times New Roman" w:cs="Times New Roman"/>
-          <w:sz w:val="28"/>
-          <w:szCs w:val="28"/>
-        </w:rPr>
-      </w:pPr>
       <w:r>
         <w:rPr>
           <w:rFonts w:ascii="Times New Roman" w:hAnsi="Times New Roman" w:cs="Times New Roman"/>
@@ -196,6 +125,13 @@
           <w:rFonts w:ascii="Times New Roman" w:hAnsi="Times New Roman" w:cs="Times New Roman"/>
           <w:sz w:val="28"/>
           <w:szCs w:val="28"/>
+        </w:rPr>
+      </w:r>
+      <w:r>
+        <w:rPr>
+          <w:rFonts w:ascii="Times New Roman" w:hAnsi="Times New Roman" w:cs="Times New Roman"/>
+          <w:sz w:val="32"/>
+          <w:szCs w:val="32"/>
         </w:rPr>
       </w:r>
     </w:p>
@@ -916,6 +852,12 @@
           <w:bCs/>
         </w:rPr>
       </w:r>
+      <w:r>
+        <w:rPr>
+          <w:b/>
+          <w:bCs/>
+        </w:rPr>
+      </w:r>
     </w:p>
     <w:p>
       <w:pPr>
@@ -932,6 +874,12 @@
           <w:b/>
         </w:rPr>
         <w:t xml:space="preserve">Блок-схема алгоритму:</w:t>
+      </w:r>
+      <w:r>
+        <w:rPr>
+          <w:b/>
+          <w:bCs/>
+        </w:rPr>
       </w:r>
       <w:r>
         <w:rPr>
@@ -1026,6 +974,12 @@
           <w:bCs/>
         </w:rPr>
       </w:r>
+      <w:r>
+        <w:rPr>
+          <w:b/>
+          <w:bCs/>
+        </w:rPr>
+      </w:r>
     </w:p>
     <w:p>
       <w:pPr>
@@ -1038,6 +992,12 @@
           <w:bCs/>
         </w:rPr>
       </w:pPr>
+      <w:r>
+        <w:rPr>
+          <w:b/>
+          <w:bCs/>
+        </w:rPr>
+      </w:r>
       <w:r>
         <w:rPr>
           <w:b/>
@@ -1137,6 +1097,12 @@
           <w:bCs/>
         </w:rPr>
       </w:r>
+      <w:r>
+        <w:rPr>
+          <w:b/>
+          <w:bCs/>
+        </w:rPr>
+      </w:r>
     </w:p>
     <w:p>
       <w:pPr>
@@ -1202,12 +1168,8 @@
       </w:hyperlink>
       <w:r>
         <w:rPr>
-          <w:rFonts w:ascii="Times New Roman" w:hAnsi="Times New Roman" w:cs="Times New Roman"/>
-          <w:b/>
-          <w:bCs/>
-          <w:sz w:val="28"/>
-          <w:szCs w:val="28"/>
-          <w:lang w:val="en-US"/>
+          <w:b w:val="0"/>
+          <w:bCs w:val="0"/>
         </w:rPr>
       </w:r>
       <w:r>
@@ -1402,27 +1364,14 @@
           <w:sz w:val="28"/>
           <w:szCs w:val="28"/>
         </w:rPr>
-      </w:r>
-      <w:r/>
-      <w:r>
-        <w:rPr>
-          <w:rFonts w:ascii="Times New Roman" w:hAnsi="Times New Roman" w:cs="Times New Roman"/>
-          <w:b/>
-          <w:bCs/>
-          <w:sz w:val="28"/>
-          <w:szCs w:val="28"/>
-        </w:rPr>
         <w:br/>
         <w:br/>
         <w:t xml:space="preserve">Висновок:</w:t>
       </w:r>
       <w:r>
         <w:rPr>
-          <w:rFonts w:ascii="Times New Roman" w:hAnsi="Times New Roman" w:cs="Times New Roman"/>
           <w:b/>
           <w:bCs/>
-          <w:sz w:val="28"/>
-          <w:szCs w:val="28"/>
         </w:rPr>
       </w:r>
       <w:r>

</xml_diff>